<commit_message>
docs: ganti nama mata kuliah menjadi Keamanan Informasi
Co-Authored-By: Claude Opus 5.5 <noreply@anthropic.com>
</commit_message>
<xml_diff>
--- a/docs/Laporan-FisioVault.docx
+++ b/docs/Laporan-FisioVault.docx
@@ -34,7 +34,7 @@
           <w:sz w:val="28"/>
           <w:szCs w:val="28"/>
         </w:rPr>
-        <w:t>MATA KULIAH KRIPTOGRAFI</w:t>
+        <w:t>MATA KULIAH KEAMANAN INFORMASI</w:t>
       </w:r>
     </w:p>
     <w:p>
@@ -267,13 +267,14 @@
           <w:sz w:val="28"/>
           <w:szCs w:val="28"/>
         </w:rPr>
+        <w:lastRenderedPageBreak/>
         <w:t>DAFTAR ISI</w:t>
       </w:r>
     </w:p>
     <w:sdt>
       <w:sdtPr>
         <w:alias w:val="Daftar Isi"/>
-        <w:id w:val="1112017149"/>
+        <w:id w:val="-694997984"/>
       </w:sdtPr>
       <w:sdtEndPr/>
       <w:sdtContent>
@@ -299,7 +300,7 @@
           <w:r>
             <w:fldChar w:fldCharType="separate"/>
           </w:r>
-          <w:hyperlink w:anchor="_Toc243951812" w:history="1">
+          <w:hyperlink w:anchor="_Toc243951935" w:history="1">
             <w:r>
               <w:rPr>
                 <w:rStyle w:val="Hyperlink"/>
@@ -323,7 +324,7 @@
               <w:rPr>
                 <w:noProof/>
               </w:rPr>
-              <w:instrText xml:space="preserve"> PAGEREF _Toc243951812 \h </w:instrText>
+              <w:instrText xml:space="preserve"> PAGEREF _Toc243951935 \h </w:instrText>
             </w:r>
             <w:r>
               <w:rPr>
@@ -363,7 +364,7 @@
               <w14:ligatures w14:val="standardContextual"/>
             </w:rPr>
           </w:pPr>
-          <w:hyperlink w:anchor="_Toc243951813" w:history="1">
+          <w:hyperlink w:anchor="_Toc243951936" w:history="1">
             <w:r>
               <w:rPr>
                 <w:rStyle w:val="Hyperlink"/>
@@ -387,7 +388,7 @@
               <w:rPr>
                 <w:noProof/>
               </w:rPr>
-              <w:instrText xml:space="preserve"> PAGEREF _Toc243951813 \h </w:instrText>
+              <w:instrText xml:space="preserve"> PAGEREF _Toc243951936 \h </w:instrText>
             </w:r>
             <w:r>
               <w:rPr>
@@ -427,7 +428,7 @@
               <w14:ligatures w14:val="standardContextual"/>
             </w:rPr>
           </w:pPr>
-          <w:hyperlink w:anchor="_Toc243951814" w:history="1">
+          <w:hyperlink w:anchor="_Toc243951937" w:history="1">
             <w:r>
               <w:rPr>
                 <w:rStyle w:val="Hyperlink"/>
@@ -451,7 +452,7 @@
               <w:rPr>
                 <w:noProof/>
               </w:rPr>
-              <w:instrText xml:space="preserve"> PAGEREF _Toc243951814 \h </w:instrText>
+              <w:instrText xml:space="preserve"> PAGEREF _Toc243951937 \h </w:instrText>
             </w:r>
             <w:r>
               <w:rPr>
@@ -491,7 +492,7 @@
               <w14:ligatures w14:val="standardContextual"/>
             </w:rPr>
           </w:pPr>
-          <w:hyperlink w:anchor="_Toc243951815" w:history="1">
+          <w:hyperlink w:anchor="_Toc243951938" w:history="1">
             <w:r>
               <w:rPr>
                 <w:rStyle w:val="Hyperlink"/>
@@ -515,7 +516,7 @@
               <w:rPr>
                 <w:noProof/>
               </w:rPr>
-              <w:instrText xml:space="preserve"> PAGEREF _Toc243951815 \h </w:instrText>
+              <w:instrText xml:space="preserve"> PAGEREF _Toc243951938 \h </w:instrText>
             </w:r>
             <w:r>
               <w:rPr>
@@ -555,7 +556,7 @@
               <w14:ligatures w14:val="standardContextual"/>
             </w:rPr>
           </w:pPr>
-          <w:hyperlink w:anchor="_Toc243951816" w:history="1">
+          <w:hyperlink w:anchor="_Toc243951939" w:history="1">
             <w:r>
               <w:rPr>
                 <w:rStyle w:val="Hyperlink"/>
@@ -579,7 +580,7 @@
               <w:rPr>
                 <w:noProof/>
               </w:rPr>
-              <w:instrText xml:space="preserve"> PAGEREF _Toc243951816 \h </w:instrText>
+              <w:instrText xml:space="preserve"> PAGEREF _Toc243951939 \h </w:instrText>
             </w:r>
             <w:r>
               <w:rPr>
@@ -619,7 +620,7 @@
               <w14:ligatures w14:val="standardContextual"/>
             </w:rPr>
           </w:pPr>
-          <w:hyperlink w:anchor="_Toc243951817" w:history="1">
+          <w:hyperlink w:anchor="_Toc243951940" w:history="1">
             <w:r>
               <w:rPr>
                 <w:rStyle w:val="Hyperlink"/>
@@ -643,7 +644,7 @@
               <w:rPr>
                 <w:noProof/>
               </w:rPr>
-              <w:instrText xml:space="preserve"> PAGEREF _Toc243951817 \h </w:instrText>
+              <w:instrText xml:space="preserve"> PAGEREF _Toc243951940 \h </w:instrText>
             </w:r>
             <w:r>
               <w:rPr>
@@ -683,7 +684,7 @@
               <w14:ligatures w14:val="standardContextual"/>
             </w:rPr>
           </w:pPr>
-          <w:hyperlink w:anchor="_Toc243951818" w:history="1">
+          <w:hyperlink w:anchor="_Toc243951941" w:history="1">
             <w:r>
               <w:rPr>
                 <w:rStyle w:val="Hyperlink"/>
@@ -707,7 +708,7 @@
               <w:rPr>
                 <w:noProof/>
               </w:rPr>
-              <w:instrText xml:space="preserve"> PAGEREF _Toc243951818 \h </w:instrText>
+              <w:instrText xml:space="preserve"> PAGEREF _Toc243951941 \h </w:instrText>
             </w:r>
             <w:r>
               <w:rPr>
@@ -747,7 +748,7 @@
               <w14:ligatures w14:val="standardContextual"/>
             </w:rPr>
           </w:pPr>
-          <w:hyperlink w:anchor="_Toc243951819" w:history="1">
+          <w:hyperlink w:anchor="_Toc243951942" w:history="1">
             <w:r>
               <w:rPr>
                 <w:rStyle w:val="Hyperlink"/>
@@ -771,7 +772,7 @@
               <w:rPr>
                 <w:noProof/>
               </w:rPr>
-              <w:instrText xml:space="preserve"> PAGEREF _Toc243951819 \h </w:instrText>
+              <w:instrText xml:space="preserve"> PAGEREF _Toc243951942 \h </w:instrText>
             </w:r>
             <w:r>
               <w:rPr>
@@ -811,7 +812,7 @@
               <w14:ligatures w14:val="standardContextual"/>
             </w:rPr>
           </w:pPr>
-          <w:hyperlink w:anchor="_Toc243951820" w:history="1">
+          <w:hyperlink w:anchor="_Toc243951943" w:history="1">
             <w:r>
               <w:rPr>
                 <w:rStyle w:val="Hyperlink"/>
@@ -835,7 +836,7 @@
               <w:rPr>
                 <w:noProof/>
               </w:rPr>
-              <w:instrText xml:space="preserve"> PAGEREF _Toc243951820 \h </w:instrText>
+              <w:instrText xml:space="preserve"> PAGEREF _Toc243951943 \h </w:instrText>
             </w:r>
             <w:r>
               <w:rPr>
@@ -875,7 +876,7 @@
               <w14:ligatures w14:val="standardContextual"/>
             </w:rPr>
           </w:pPr>
-          <w:hyperlink w:anchor="_Toc243951821" w:history="1">
+          <w:hyperlink w:anchor="_Toc243951944" w:history="1">
             <w:r>
               <w:rPr>
                 <w:rStyle w:val="Hyperlink"/>
@@ -899,7 +900,7 @@
               <w:rPr>
                 <w:noProof/>
               </w:rPr>
-              <w:instrText xml:space="preserve"> PAGEREF _Toc243951821 \h </w:instrText>
+              <w:instrText xml:space="preserve"> PAGEREF _Toc243951944 \h </w:instrText>
             </w:r>
             <w:r>
               <w:rPr>
@@ -939,7 +940,7 @@
               <w14:ligatures w14:val="standardContextual"/>
             </w:rPr>
           </w:pPr>
-          <w:hyperlink w:anchor="_Toc243951822" w:history="1">
+          <w:hyperlink w:anchor="_Toc243951945" w:history="1">
             <w:r>
               <w:rPr>
                 <w:rStyle w:val="Hyperlink"/>
@@ -963,7 +964,7 @@
               <w:rPr>
                 <w:noProof/>
               </w:rPr>
-              <w:instrText xml:space="preserve"> PAGEREF _Toc243951822 \h </w:instrText>
+              <w:instrText xml:space="preserve"> PAGEREF _Toc243951945 \h </w:instrText>
             </w:r>
             <w:r>
               <w:rPr>
@@ -1003,7 +1004,7 @@
               <w14:ligatures w14:val="standardContextual"/>
             </w:rPr>
           </w:pPr>
-          <w:hyperlink w:anchor="_Toc243951823" w:history="1">
+          <w:hyperlink w:anchor="_Toc243951946" w:history="1">
             <w:r>
               <w:rPr>
                 <w:rStyle w:val="Hyperlink"/>
@@ -1027,7 +1028,7 @@
               <w:rPr>
                 <w:noProof/>
               </w:rPr>
-              <w:instrText xml:space="preserve"> PAGEREF _Toc243951823 \h </w:instrText>
+              <w:instrText xml:space="preserve"> PAGEREF _Toc243951946 \h </w:instrText>
             </w:r>
             <w:r>
               <w:rPr>
@@ -1067,7 +1068,7 @@
               <w14:ligatures w14:val="standardContextual"/>
             </w:rPr>
           </w:pPr>
-          <w:hyperlink w:anchor="_Toc243951824" w:history="1">
+          <w:hyperlink w:anchor="_Toc243951947" w:history="1">
             <w:r>
               <w:rPr>
                 <w:rStyle w:val="Hyperlink"/>
@@ -1091,7 +1092,7 @@
               <w:rPr>
                 <w:noProof/>
               </w:rPr>
-              <w:instrText xml:space="preserve"> PAGEREF _Toc243951824 \h </w:instrText>
+              <w:instrText xml:space="preserve"> PAGEREF _Toc243951947 \h </w:instrText>
             </w:r>
             <w:r>
               <w:rPr>
@@ -1131,7 +1132,7 @@
               <w14:ligatures w14:val="standardContextual"/>
             </w:rPr>
           </w:pPr>
-          <w:hyperlink w:anchor="_Toc243951825" w:history="1">
+          <w:hyperlink w:anchor="_Toc243951948" w:history="1">
             <w:r>
               <w:rPr>
                 <w:rStyle w:val="Hyperlink"/>
@@ -1155,7 +1156,7 @@
               <w:rPr>
                 <w:noProof/>
               </w:rPr>
-              <w:instrText xml:space="preserve"> PAGEREF _Toc243951825 \h </w:instrText>
+              <w:instrText xml:space="preserve"> PAGEREF _Toc243951948 \h </w:instrText>
             </w:r>
             <w:r>
               <w:rPr>
@@ -1195,7 +1196,7 @@
               <w14:ligatures w14:val="standardContextual"/>
             </w:rPr>
           </w:pPr>
-          <w:hyperlink w:anchor="_Toc243951826" w:history="1">
+          <w:hyperlink w:anchor="_Toc243951949" w:history="1">
             <w:r>
               <w:rPr>
                 <w:rStyle w:val="Hyperlink"/>
@@ -1219,7 +1220,7 @@
               <w:rPr>
                 <w:noProof/>
               </w:rPr>
-              <w:instrText xml:space="preserve"> PAGEREF _Toc243951826 \h </w:instrText>
+              <w:instrText xml:space="preserve"> PAGEREF _Toc243951949 \h </w:instrText>
             </w:r>
             <w:r>
               <w:rPr>
@@ -1259,7 +1260,7 @@
               <w14:ligatures w14:val="standardContextual"/>
             </w:rPr>
           </w:pPr>
-          <w:hyperlink w:anchor="_Toc243951827" w:history="1">
+          <w:hyperlink w:anchor="_Toc243951950" w:history="1">
             <w:r>
               <w:rPr>
                 <w:rStyle w:val="Hyperlink"/>
@@ -1283,7 +1284,7 @@
               <w:rPr>
                 <w:noProof/>
               </w:rPr>
-              <w:instrText xml:space="preserve"> PAGEREF _Toc243951827 \h </w:instrText>
+              <w:instrText xml:space="preserve"> PAGEREF _Toc243951950 \h </w:instrText>
             </w:r>
             <w:r>
               <w:rPr>
@@ -1323,7 +1324,7 @@
               <w14:ligatures w14:val="standardContextual"/>
             </w:rPr>
           </w:pPr>
-          <w:hyperlink w:anchor="_Toc243951828" w:history="1">
+          <w:hyperlink w:anchor="_Toc243951951" w:history="1">
             <w:r>
               <w:rPr>
                 <w:rStyle w:val="Hyperlink"/>
@@ -1347,7 +1348,7 @@
               <w:rPr>
                 <w:noProof/>
               </w:rPr>
-              <w:instrText xml:space="preserve"> PAGEREF _Toc243951828 \h </w:instrText>
+              <w:instrText xml:space="preserve"> PAGEREF _Toc243951951 \h </w:instrText>
             </w:r>
             <w:r>
               <w:rPr>
@@ -1387,7 +1388,7 @@
               <w14:ligatures w14:val="standardContextual"/>
             </w:rPr>
           </w:pPr>
-          <w:hyperlink w:anchor="_Toc243951829" w:history="1">
+          <w:hyperlink w:anchor="_Toc243951952" w:history="1">
             <w:r>
               <w:rPr>
                 <w:rStyle w:val="Hyperlink"/>
@@ -1411,7 +1412,7 @@
               <w:rPr>
                 <w:noProof/>
               </w:rPr>
-              <w:instrText xml:space="preserve"> PAGEREF _Toc243951829 \h </w:instrText>
+              <w:instrText xml:space="preserve"> PAGEREF _Toc243951952 \h </w:instrText>
             </w:r>
             <w:r>
               <w:rPr>
@@ -1451,7 +1452,7 @@
               <w14:ligatures w14:val="standardContextual"/>
             </w:rPr>
           </w:pPr>
-          <w:hyperlink w:anchor="_Toc243951830" w:history="1">
+          <w:hyperlink w:anchor="_Toc243951953" w:history="1">
             <w:r>
               <w:rPr>
                 <w:rStyle w:val="Hyperlink"/>
@@ -1475,7 +1476,7 @@
               <w:rPr>
                 <w:noProof/>
               </w:rPr>
-              <w:instrText xml:space="preserve"> PAGEREF _Toc243951830 \h </w:instrText>
+              <w:instrText xml:space="preserve"> PAGEREF _Toc243951953 \h </w:instrText>
             </w:r>
             <w:r>
               <w:rPr>
@@ -1515,7 +1516,7 @@
               <w14:ligatures w14:val="standardContextual"/>
             </w:rPr>
           </w:pPr>
-          <w:hyperlink w:anchor="_Toc243951831" w:history="1">
+          <w:hyperlink w:anchor="_Toc243951954" w:history="1">
             <w:r>
               <w:rPr>
                 <w:rStyle w:val="Hyperlink"/>
@@ -1539,7 +1540,7 @@
               <w:rPr>
                 <w:noProof/>
               </w:rPr>
-              <w:instrText xml:space="preserve"> PAGEREF _Toc243951831 \h </w:instrText>
+              <w:instrText xml:space="preserve"> PAGEREF _Toc243951954 \h </w:instrText>
             </w:r>
             <w:r>
               <w:rPr>
@@ -1579,7 +1580,7 @@
               <w14:ligatures w14:val="standardContextual"/>
             </w:rPr>
           </w:pPr>
-          <w:hyperlink w:anchor="_Toc243951832" w:history="1">
+          <w:hyperlink w:anchor="_Toc243951955" w:history="1">
             <w:r>
               <w:rPr>
                 <w:rStyle w:val="Hyperlink"/>
@@ -1603,7 +1604,7 @@
               <w:rPr>
                 <w:noProof/>
               </w:rPr>
-              <w:instrText xml:space="preserve"> PAGEREF _Toc243951832 \h </w:instrText>
+              <w:instrText xml:space="preserve"> PAGEREF _Toc243951955 \h </w:instrText>
             </w:r>
             <w:r>
               <w:rPr>
@@ -1643,7 +1644,7 @@
               <w14:ligatures w14:val="standardContextual"/>
             </w:rPr>
           </w:pPr>
-          <w:hyperlink w:anchor="_Toc243951833" w:history="1">
+          <w:hyperlink w:anchor="_Toc243951956" w:history="1">
             <w:r>
               <w:rPr>
                 <w:rStyle w:val="Hyperlink"/>
@@ -1667,7 +1668,7 @@
               <w:rPr>
                 <w:noProof/>
               </w:rPr>
-              <w:instrText xml:space="preserve"> PAGEREF _Toc243951833 \h </w:instrText>
+              <w:instrText xml:space="preserve"> PAGEREF _Toc243951956 \h </w:instrText>
             </w:r>
             <w:r>
               <w:rPr>
@@ -1707,7 +1708,7 @@
               <w14:ligatures w14:val="standardContextual"/>
             </w:rPr>
           </w:pPr>
-          <w:hyperlink w:anchor="_Toc243951834" w:history="1">
+          <w:hyperlink w:anchor="_Toc243951957" w:history="1">
             <w:r>
               <w:rPr>
                 <w:rStyle w:val="Hyperlink"/>
@@ -1731,7 +1732,7 @@
               <w:rPr>
                 <w:noProof/>
               </w:rPr>
-              <w:instrText xml:space="preserve"> PAGEREF _Toc243951834 \h </w:instrText>
+              <w:instrText xml:space="preserve"> PAGEREF _Toc243951957 \h </w:instrText>
             </w:r>
             <w:r>
               <w:rPr>
@@ -1771,7 +1772,7 @@
               <w14:ligatures w14:val="standardContextual"/>
             </w:rPr>
           </w:pPr>
-          <w:hyperlink w:anchor="_Toc243951835" w:history="1">
+          <w:hyperlink w:anchor="_Toc243951958" w:history="1">
             <w:r>
               <w:rPr>
                 <w:rStyle w:val="Hyperlink"/>
@@ -1795,7 +1796,7 @@
               <w:rPr>
                 <w:noProof/>
               </w:rPr>
-              <w:instrText xml:space="preserve"> PAGEREF _Toc243951835 \h </w:instrText>
+              <w:instrText xml:space="preserve"> PAGEREF _Toc243951958 \h </w:instrText>
             </w:r>
             <w:r>
               <w:rPr>
@@ -1835,7 +1836,7 @@
               <w14:ligatures w14:val="standardContextual"/>
             </w:rPr>
           </w:pPr>
-          <w:hyperlink w:anchor="_Toc243951836" w:history="1">
+          <w:hyperlink w:anchor="_Toc243951959" w:history="1">
             <w:r>
               <w:rPr>
                 <w:rStyle w:val="Hyperlink"/>
@@ -1859,7 +1860,7 @@
               <w:rPr>
                 <w:noProof/>
               </w:rPr>
-              <w:instrText xml:space="preserve"> PAGEREF _Toc243951836 \h </w:instrText>
+              <w:instrText xml:space="preserve"> PAGEREF _Toc243951959 \h </w:instrText>
             </w:r>
             <w:r>
               <w:rPr>
@@ -1899,7 +1900,7 @@
               <w14:ligatures w14:val="standardContextual"/>
             </w:rPr>
           </w:pPr>
-          <w:hyperlink w:anchor="_Toc243951837" w:history="1">
+          <w:hyperlink w:anchor="_Toc243951960" w:history="1">
             <w:r>
               <w:rPr>
                 <w:rStyle w:val="Hyperlink"/>
@@ -1923,7 +1924,7 @@
               <w:rPr>
                 <w:noProof/>
               </w:rPr>
-              <w:instrText xml:space="preserve"> PAGEREF _Toc243951837 \h </w:instrText>
+              <w:instrText xml:space="preserve"> PAGEREF _Toc243951960 \h </w:instrText>
             </w:r>
             <w:r>
               <w:rPr>
@@ -1963,7 +1964,7 @@
               <w14:ligatures w14:val="standardContextual"/>
             </w:rPr>
           </w:pPr>
-          <w:hyperlink w:anchor="_Toc243951838" w:history="1">
+          <w:hyperlink w:anchor="_Toc243951961" w:history="1">
             <w:r>
               <w:rPr>
                 <w:rStyle w:val="Hyperlink"/>
@@ -1987,7 +1988,7 @@
               <w:rPr>
                 <w:noProof/>
               </w:rPr>
-              <w:instrText xml:space="preserve"> PAGEREF _Toc243951838 \h </w:instrText>
+              <w:instrText xml:space="preserve"> PAGEREF _Toc243951961 \h </w:instrText>
             </w:r>
             <w:r>
               <w:rPr>
@@ -2027,7 +2028,7 @@
               <w14:ligatures w14:val="standardContextual"/>
             </w:rPr>
           </w:pPr>
-          <w:hyperlink w:anchor="_Toc243951839" w:history="1">
+          <w:hyperlink w:anchor="_Toc243951962" w:history="1">
             <w:r>
               <w:rPr>
                 <w:rStyle w:val="Hyperlink"/>
@@ -2051,7 +2052,7 @@
               <w:rPr>
                 <w:noProof/>
               </w:rPr>
-              <w:instrText xml:space="preserve"> PAGEREF _Toc243951839 \h </w:instrText>
+              <w:instrText xml:space="preserve"> PAGEREF _Toc243951962 \h </w:instrText>
             </w:r>
             <w:r>
               <w:rPr>
@@ -2091,7 +2092,7 @@
               <w14:ligatures w14:val="standardContextual"/>
             </w:rPr>
           </w:pPr>
-          <w:hyperlink w:anchor="_Toc243951840" w:history="1">
+          <w:hyperlink w:anchor="_Toc243951963" w:history="1">
             <w:r>
               <w:rPr>
                 <w:rStyle w:val="Hyperlink"/>
@@ -2115,7 +2116,7 @@
               <w:rPr>
                 <w:noProof/>
               </w:rPr>
-              <w:instrText xml:space="preserve"> PAGEREF _Toc243951840 \h </w:instrText>
+              <w:instrText xml:space="preserve"> PAGEREF _Toc243951963 \h </w:instrText>
             </w:r>
             <w:r>
               <w:rPr>
@@ -2155,7 +2156,7 @@
               <w14:ligatures w14:val="standardContextual"/>
             </w:rPr>
           </w:pPr>
-          <w:hyperlink w:anchor="_Toc243951841" w:history="1">
+          <w:hyperlink w:anchor="_Toc243951964" w:history="1">
             <w:r>
               <w:rPr>
                 <w:rStyle w:val="Hyperlink"/>
@@ -2179,7 +2180,7 @@
               <w:rPr>
                 <w:noProof/>
               </w:rPr>
-              <w:instrText xml:space="preserve"> PAGEREF _Toc243951841 \h </w:instrText>
+              <w:instrText xml:space="preserve"> PAGEREF _Toc243951964 \h </w:instrText>
             </w:r>
             <w:r>
               <w:rPr>
@@ -2218,8 +2219,9 @@
         <w:pStyle w:val="Heading1"/>
         <w:pageBreakBefore/>
       </w:pPr>
-      <w:bookmarkStart w:id="0" w:name="_Toc243951812"/>
-      <w:r>
+      <w:bookmarkStart w:id="0" w:name="_Toc243951935"/>
+      <w:r>
+        <w:lastRenderedPageBreak/>
         <w:t>BAB I PENDAHULUAN</w:t>
       </w:r>
       <w:bookmarkEnd w:id="0"/>
@@ -2228,7 +2230,7 @@
       <w:pPr>
         <w:pStyle w:val="Heading2"/>
       </w:pPr>
-      <w:bookmarkStart w:id="1" w:name="_Toc243951813"/>
+      <w:bookmarkStart w:id="1" w:name="_Toc243951936"/>
       <w:r>
         <w:t>1.1 Latar Belakang</w:t>
       </w:r>
@@ -2286,7 +2288,7 @@
       <w:pPr>
         <w:pStyle w:val="Heading2"/>
       </w:pPr>
-      <w:bookmarkStart w:id="2" w:name="_Toc243951814"/>
+      <w:bookmarkStart w:id="2" w:name="_Toc243951937"/>
       <w:r>
         <w:t>1.2 Rumusan Masalah</w:t>
       </w:r>
@@ -2338,7 +2340,7 @@
       <w:pPr>
         <w:pStyle w:val="Heading2"/>
       </w:pPr>
-      <w:bookmarkStart w:id="3" w:name="_Toc243951815"/>
+      <w:bookmarkStart w:id="3" w:name="_Toc243951938"/>
       <w:r>
         <w:t>1.3 Tujuan</w:t>
       </w:r>
@@ -2390,7 +2392,7 @@
       <w:pPr>
         <w:pStyle w:val="Heading2"/>
       </w:pPr>
-      <w:bookmarkStart w:id="4" w:name="_Toc243951816"/>
+      <w:bookmarkStart w:id="4" w:name="_Toc243951939"/>
       <w:r>
         <w:t>1.4 Batasan Masalah</w:t>
       </w:r>
@@ -2421,6 +2423,7 @@
         <w:jc w:val="both"/>
       </w:pPr>
       <w:r>
+        <w:lastRenderedPageBreak/>
         <w:t xml:space="preserve">Ketiga algoritma dijalankan melalui modul </w:t>
       </w:r>
       <w:r>
@@ -2468,7 +2471,7 @@
         <w:pStyle w:val="Heading1"/>
         <w:pageBreakBefore/>
       </w:pPr>
-      <w:bookmarkStart w:id="5" w:name="_Toc243951817"/>
+      <w:bookmarkStart w:id="5" w:name="_Toc243951940"/>
       <w:r>
         <w:t>BAB II DASAR TEORI</w:t>
       </w:r>
@@ -2478,7 +2481,7 @@
       <w:pPr>
         <w:pStyle w:val="Heading2"/>
       </w:pPr>
-      <w:bookmarkStart w:id="6" w:name="_Toc243951818"/>
+      <w:bookmarkStart w:id="6" w:name="_Toc243951941"/>
       <w:r>
         <w:t>2.1 Advanced Encryption Standard (AES) dan Mode GCM</w:t>
       </w:r>
@@ -2506,7 +2509,7 @@
       <w:pPr>
         <w:pStyle w:val="Heading2"/>
       </w:pPr>
-      <w:bookmarkStart w:id="7" w:name="_Toc243951819"/>
+      <w:bookmarkStart w:id="7" w:name="_Toc243951942"/>
       <w:r>
         <w:t>2.2 Data Encryption Standard (DES) dan Mode CBC</w:t>
       </w:r>
@@ -2543,7 +2546,7 @@
       <w:pPr>
         <w:pStyle w:val="Heading2"/>
       </w:pPr>
-      <w:bookmarkStart w:id="8" w:name="_Toc243951820"/>
+      <w:bookmarkStart w:id="8" w:name="_Toc243951943"/>
       <w:r>
         <w:t>2.3 RC4</w:t>
       </w:r>
@@ -2565,7 +2568,7 @@
       <w:pPr>
         <w:pStyle w:val="Heading2"/>
       </w:pPr>
-      <w:bookmarkStart w:id="9" w:name="_Toc243951821"/>
+      <w:bookmarkStart w:id="9" w:name="_Toc243951944"/>
       <w:r>
         <w:t>2.4 Hashing Password dengan Argon2id</w:t>
       </w:r>
@@ -2584,7 +2587,7 @@
       <w:pPr>
         <w:pStyle w:val="Heading2"/>
       </w:pPr>
-      <w:bookmarkStart w:id="10" w:name="_Toc243951822"/>
+      <w:bookmarkStart w:id="10" w:name="_Toc243951945"/>
       <w:r>
         <w:t>2.5 Envelope Encryption</w:t>
       </w:r>
@@ -2604,7 +2607,7 @@
         <w:pStyle w:val="Heading1"/>
         <w:pageBreakBefore/>
       </w:pPr>
-      <w:bookmarkStart w:id="11" w:name="_Toc243951823"/>
+      <w:bookmarkStart w:id="11" w:name="_Toc243951946"/>
       <w:r>
         <w:t>BAB III PERANCANGAN DAN IMPLEMENTASI</w:t>
       </w:r>
@@ -2614,7 +2617,7 @@
       <w:pPr>
         <w:pStyle w:val="Heading2"/>
       </w:pPr>
-      <w:bookmarkStart w:id="12" w:name="_Toc243951824"/>
+      <w:bookmarkStart w:id="12" w:name="_Toc243951947"/>
       <w:r>
         <w:t>3.1 Arsitektur Sistem</w:t>
       </w:r>
@@ -4318,7 +4321,7 @@
       <w:pPr>
         <w:pStyle w:val="Heading2"/>
       </w:pPr>
-      <w:bookmarkStart w:id="13" w:name="_Toc243951825"/>
+      <w:bookmarkStart w:id="13" w:name="_Toc243951948"/>
       <w:r>
         <w:t>3.2 Desain Kriptografi</w:t>
       </w:r>
@@ -6066,7 +6069,7 @@
       <w:pPr>
         <w:pStyle w:val="Heading2"/>
       </w:pPr>
-      <w:bookmarkStart w:id="14" w:name="_Toc243951826"/>
+      <w:bookmarkStart w:id="14" w:name="_Toc243951949"/>
       <w:r>
         <w:t>3.3 Keamanan Aplikasi</w:t>
       </w:r>
@@ -6898,7 +6901,7 @@
       <w:pPr>
         <w:pStyle w:val="Heading2"/>
       </w:pPr>
-      <w:bookmarkStart w:id="15" w:name="_Toc243951827"/>
+      <w:bookmarkStart w:id="15" w:name="_Toc243951950"/>
       <w:r>
         <w:t>3.4 Antarmuka Pengguna</w:t>
       </w:r>
@@ -6918,7 +6921,7 @@
         <w:pStyle w:val="Heading1"/>
         <w:pageBreakBefore/>
       </w:pPr>
-      <w:bookmarkStart w:id="16" w:name="_Toc243951828"/>
+      <w:bookmarkStart w:id="16" w:name="_Toc243951951"/>
       <w:r>
         <w:t>BAB IV PENGUJIAN DAN ANALISIS</w:t>
       </w:r>
@@ -6928,7 +6931,7 @@
       <w:pPr>
         <w:pStyle w:val="Heading2"/>
       </w:pPr>
-      <w:bookmarkStart w:id="17" w:name="_Toc243951829"/>
+      <w:bookmarkStart w:id="17" w:name="_Toc243951952"/>
       <w:r>
         <w:t>4.1 Pengujian Fungsional</w:t>
       </w:r>
@@ -7617,7 +7620,7 @@
       <w:pPr>
         <w:pStyle w:val="Heading2"/>
       </w:pPr>
-      <w:bookmarkStart w:id="18" w:name="_Toc243951830"/>
+      <w:bookmarkStart w:id="18" w:name="_Toc243951953"/>
       <w:r>
         <w:t>4.2 Metodologi Benchmark</w:t>
       </w:r>
@@ -7731,7 +7734,7 @@
       <w:pPr>
         <w:pStyle w:val="Heading2"/>
       </w:pPr>
-      <w:bookmarkStart w:id="19" w:name="_Toc243951831"/>
+      <w:bookmarkStart w:id="19" w:name="_Toc243951954"/>
       <w:r>
         <w:t>4.3 Hasil Benchmark</w:t>
       </w:r>
@@ -10357,7 +10360,7 @@
       <w:pPr>
         <w:pStyle w:val="Heading2"/>
       </w:pPr>
-      <w:bookmarkStart w:id="20" w:name="_Toc243951832"/>
+      <w:bookmarkStart w:id="20" w:name="_Toc243951955"/>
       <w:r>
         <w:t>4.4 Analisis Kinerja</w:t>
       </w:r>
@@ -10481,7 +10484,7 @@
       <w:pPr>
         <w:pStyle w:val="Heading2"/>
       </w:pPr>
-      <w:bookmarkStart w:id="21" w:name="_Toc243951833"/>
+      <w:bookmarkStart w:id="21" w:name="_Toc243951956"/>
       <w:r>
         <w:t>4.5 Perbandingan Keamanan</w:t>
       </w:r>
@@ -11250,7 +11253,7 @@
         <w:pStyle w:val="Heading1"/>
         <w:pageBreakBefore/>
       </w:pPr>
-      <w:bookmarkStart w:id="22" w:name="_Toc243951834"/>
+      <w:bookmarkStart w:id="22" w:name="_Toc243951957"/>
       <w:r>
         <w:t>BAB V KESIMPULAN DAN SARAN</w:t>
       </w:r>
@@ -11260,7 +11263,7 @@
       <w:pPr>
         <w:pStyle w:val="Heading2"/>
       </w:pPr>
-      <w:bookmarkStart w:id="23" w:name="_Toc243951835"/>
+      <w:bookmarkStart w:id="23" w:name="_Toc243951958"/>
       <w:r>
         <w:t>5.1 Kesimpulan</w:t>
       </w:r>
@@ -11361,7 +11364,7 @@
       <w:pPr>
         <w:pStyle w:val="Heading2"/>
       </w:pPr>
-      <w:bookmarkStart w:id="24" w:name="_Toc243951836"/>
+      <w:bookmarkStart w:id="24" w:name="_Toc243951959"/>
       <w:r>
         <w:t>5.2 Saran</w:t>
       </w:r>
@@ -11470,7 +11473,7 @@
         <w:pStyle w:val="Heading1"/>
         <w:pageBreakBefore/>
       </w:pPr>
-      <w:bookmarkStart w:id="25" w:name="_Toc243951837"/>
+      <w:bookmarkStart w:id="25" w:name="_Toc243951960"/>
       <w:r>
         <w:t>DAFTAR PUSTAKA</w:t>
       </w:r>
@@ -11635,7 +11638,7 @@
         <w:pStyle w:val="Heading1"/>
         <w:pageBreakBefore/>
       </w:pPr>
-      <w:bookmarkStart w:id="26" w:name="_Toc243951838"/>
+      <w:bookmarkStart w:id="26" w:name="_Toc243951961"/>
       <w:r>
         <w:t>LAMPIRAN</w:t>
       </w:r>
@@ -11645,7 +11648,7 @@
       <w:pPr>
         <w:pStyle w:val="Heading2"/>
       </w:pPr>
-      <w:bookmarkStart w:id="27" w:name="_Toc243951839"/>
+      <w:bookmarkStart w:id="27" w:name="_Toc243951962"/>
       <w:r>
         <w:t>A. Repositori Kode</w:t>
       </w:r>
@@ -12118,7 +12121,7 @@
       <w:pPr>
         <w:pStyle w:val="Heading2"/>
       </w:pPr>
-      <w:bookmarkStart w:id="28" w:name="_Toc243951840"/>
+      <w:bookmarkStart w:id="28" w:name="_Toc243951963"/>
       <w:r>
         <w:t>B. Cara Menjalankan</w:t>
       </w:r>
@@ -12286,7 +12289,7 @@
       <w:pPr>
         <w:pStyle w:val="Heading2"/>
       </w:pPr>
-      <w:bookmarkStart w:id="29" w:name="_Toc243951841"/>
+      <w:bookmarkStart w:id="29" w:name="_Toc243951964"/>
       <w:r>
         <w:t>C. Log Percakapan dengan Asisten AI</w:t>
       </w:r>
@@ -12443,10 +12446,10 @@
 <file path=word/numbering.xml><?xml version="1.0" encoding="utf-8"?>
 <w:numbering xmlns:wpc="http://schemas.microsoft.com/office/word/2010/wordprocessingCanvas" xmlns:cx="http://schemas.microsoft.com/office/drawing/2014/chartex" xmlns:cx1="http://schemas.microsoft.com/office/drawing/2015/9/8/chartex" xmlns:cx2="http://schemas.microsoft.com/office/drawing/2015/10/21/chartex" xmlns:cx3="http://schemas.microsoft.com/office/drawing/2016/5/9/chartex" xmlns:cx4="http://schemas.microsoft.com/office/drawing/2016/5/10/chartex" xmlns:cx5="http://schemas.microsoft.com/office/drawing/2016/5/11/chartex" xmlns:cx6="http://schemas.microsoft.com/office/drawing/2016/5/12/chartex" xmlns:cx7="http://schemas.microsoft.com/office/drawing/2016/5/13/chartex" xmlns:cx8="http://schemas.microsoft.com/office/drawing/2016/5/14/chartex" xmlns:mc="http://schemas.openxmlformats.org/markup-compatibility/2006" xmlns:aink="http://schemas.microsoft.com/office/drawing/2016/ink" xmlns:am3d="http://schemas.microsoft.com/office/drawing/2017/model3d" xmlns:o="urn:schemas-microsoft-com:office:office" xmlns:oel="http://schemas.microsoft.com/office/2019/extlst" xmlns:r="http://schemas.openxmlformats.org/officeDocument/2006/relationships" xmlns:m="http://schemas.openxmlformats.org/officeDocument/2006/math" xmlns:v="urn:schemas-microsoft-com:vml" xmlns:wp14="http://schemas.microsoft.com/office/word/2010/wordprocessingDrawing" xmlns:wp="http://schemas.openxmlformats.org/drawingml/2006/wordprocessingDrawing" xmlns:w10="urn:schemas-microsoft-com:office:word" xmlns:w="http://schemas.openxmlformats.org/wordprocessingml/2006/main" xmlns:w14="http://schemas.microsoft.com/office/word/2010/wordml" xmlns:w15="http://schemas.microsoft.com/office/word/2012/wordml" xmlns:w16cex="http://schemas.microsoft.com/office/word/2018/wordml/cex" xmlns:w16cid="http://schemas.microsoft.com/office/word/2016/wordml/cid" xmlns:w16="http://schemas.microsoft.com/office/word/2018/wordml" xmlns:w16du="http://schemas.microsoft.com/office/word/2023/wordml/word16du" xmlns:w16sdtdh="http://schemas.microsoft.com/office/word/2020/wordml/sdtdatahash" xmlns:w16sdtfl="http://schemas.microsoft.com/office/word/2024/wordml/sdtformatlock" xmlns:w16se="http://schemas.microsoft.com/office/word/2015/wordml/symex" xmlns:wpg="http://schemas.microsoft.com/office/word/2010/wordprocessingGroup" xmlns:wpi="http://schemas.microsoft.com/office/word/2010/wordprocessingInk" xmlns:wne="http://schemas.microsoft.com/office/word/2006/wordml" xmlns:wps="http://schemas.microsoft.com/office/word/2010/wordprocessingShape" mc:Ignorable="w14 w15 w16se w16cid w16 w16cex w16sdtdh w16sdtfl w16du wp14">
   <w:abstractNum w:abstractNumId="0" w15:restartNumberingAfterBreak="0">
-    <w:nsid w:val="01AF472A"/>
+    <w:nsid w:val="1A2C3646"/>
     <w:multiLevelType w:val="hybridMultilevel"/>
-    <w:tmpl w:val="C4989C62"/>
-    <w:lvl w:ilvl="0" w:tplc="D1E86454">
+    <w:tmpl w:val="B7E2F3F0"/>
+    <w:lvl w:ilvl="0" w:tplc="0818CE28">
       <w:start w:val="1"/>
       <w:numFmt w:val="decimal"/>
       <w:lvlText w:val="%1."/>
@@ -12455,52 +12458,52 @@
         <w:ind w:left="720" w:hanging="360"/>
       </w:pPr>
     </w:lvl>
-    <w:lvl w:ilvl="1" w:tplc="5622CB0A">
+    <w:lvl w:ilvl="1" w:tplc="85FED3F6">
       <w:numFmt w:val="decimal"/>
       <w:lvlText w:val=""/>
       <w:lvlJc w:val="left"/>
     </w:lvl>
-    <w:lvl w:ilvl="2" w:tplc="C25E0CAC">
+    <w:lvl w:ilvl="2" w:tplc="0032C3A6">
       <w:numFmt w:val="decimal"/>
       <w:lvlText w:val=""/>
       <w:lvlJc w:val="left"/>
     </w:lvl>
-    <w:lvl w:ilvl="3" w:tplc="7A34782E">
+    <w:lvl w:ilvl="3" w:tplc="6AB8AF5E">
       <w:numFmt w:val="decimal"/>
       <w:lvlText w:val=""/>
       <w:lvlJc w:val="left"/>
     </w:lvl>
-    <w:lvl w:ilvl="4" w:tplc="0E5E7A74">
+    <w:lvl w:ilvl="4" w:tplc="311EC178">
       <w:numFmt w:val="decimal"/>
       <w:lvlText w:val=""/>
       <w:lvlJc w:val="left"/>
     </w:lvl>
-    <w:lvl w:ilvl="5" w:tplc="4A76F24C">
+    <w:lvl w:ilvl="5" w:tplc="A378D972">
       <w:numFmt w:val="decimal"/>
       <w:lvlText w:val=""/>
       <w:lvlJc w:val="left"/>
     </w:lvl>
-    <w:lvl w:ilvl="6" w:tplc="DC4CE59A">
+    <w:lvl w:ilvl="6" w:tplc="A11C1792">
       <w:numFmt w:val="decimal"/>
       <w:lvlText w:val=""/>
       <w:lvlJc w:val="left"/>
     </w:lvl>
-    <w:lvl w:ilvl="7" w:tplc="C952F6DE">
+    <w:lvl w:ilvl="7" w:tplc="A9AE1A24">
       <w:numFmt w:val="decimal"/>
       <w:lvlText w:val=""/>
       <w:lvlJc w:val="left"/>
     </w:lvl>
-    <w:lvl w:ilvl="8" w:tplc="3CA4AE3A">
+    <w:lvl w:ilvl="8" w:tplc="43C2E846">
       <w:numFmt w:val="decimal"/>
       <w:lvlText w:val=""/>
       <w:lvlJc w:val="left"/>
     </w:lvl>
   </w:abstractNum>
   <w:abstractNum w:abstractNumId="1" w15:restartNumberingAfterBreak="0">
-    <w:nsid w:val="06F940D3"/>
+    <w:nsid w:val="1C9D6574"/>
     <w:multiLevelType w:val="hybridMultilevel"/>
-    <w:tmpl w:val="5356A4FC"/>
-    <w:lvl w:ilvl="0" w:tplc="FEFA6932">
+    <w:tmpl w:val="A9523984"/>
+    <w:lvl w:ilvl="0" w:tplc="CE76FF3E">
       <w:start w:val="1"/>
       <w:numFmt w:val="decimal"/>
       <w:lvlText w:val="%1."/>
@@ -12509,52 +12512,52 @@
         <w:ind w:left="720" w:hanging="360"/>
       </w:pPr>
     </w:lvl>
-    <w:lvl w:ilvl="1" w:tplc="28FCA638">
+    <w:lvl w:ilvl="1" w:tplc="863C0BD2">
       <w:numFmt w:val="decimal"/>
       <w:lvlText w:val=""/>
       <w:lvlJc w:val="left"/>
     </w:lvl>
-    <w:lvl w:ilvl="2" w:tplc="20C0C8E4">
+    <w:lvl w:ilvl="2" w:tplc="F2FA122C">
       <w:numFmt w:val="decimal"/>
       <w:lvlText w:val=""/>
       <w:lvlJc w:val="left"/>
     </w:lvl>
-    <w:lvl w:ilvl="3" w:tplc="5D6C65E2">
+    <w:lvl w:ilvl="3" w:tplc="6D2EF3FA">
       <w:numFmt w:val="decimal"/>
       <w:lvlText w:val=""/>
       <w:lvlJc w:val="left"/>
     </w:lvl>
-    <w:lvl w:ilvl="4" w:tplc="2318C31C">
+    <w:lvl w:ilvl="4" w:tplc="659EC10A">
       <w:numFmt w:val="decimal"/>
       <w:lvlText w:val=""/>
       <w:lvlJc w:val="left"/>
     </w:lvl>
-    <w:lvl w:ilvl="5" w:tplc="B038FE92">
+    <w:lvl w:ilvl="5" w:tplc="42122C36">
       <w:numFmt w:val="decimal"/>
       <w:lvlText w:val=""/>
       <w:lvlJc w:val="left"/>
     </w:lvl>
-    <w:lvl w:ilvl="6" w:tplc="BFD003DC">
+    <w:lvl w:ilvl="6" w:tplc="57085994">
       <w:numFmt w:val="decimal"/>
       <w:lvlText w:val=""/>
       <w:lvlJc w:val="left"/>
     </w:lvl>
-    <w:lvl w:ilvl="7" w:tplc="74A2FE36">
+    <w:lvl w:ilvl="7" w:tplc="EFDA3E52">
       <w:numFmt w:val="decimal"/>
       <w:lvlText w:val=""/>
       <w:lvlJc w:val="left"/>
     </w:lvl>
-    <w:lvl w:ilvl="8" w:tplc="EDD0EB6C">
+    <w:lvl w:ilvl="8" w:tplc="4566DECC">
       <w:numFmt w:val="decimal"/>
       <w:lvlText w:val=""/>
       <w:lvlJc w:val="left"/>
     </w:lvl>
   </w:abstractNum>
   <w:abstractNum w:abstractNumId="2" w15:restartNumberingAfterBreak="0">
-    <w:nsid w:val="13F13731"/>
+    <w:nsid w:val="1E294F5B"/>
     <w:multiLevelType w:val="hybridMultilevel"/>
-    <w:tmpl w:val="18168468"/>
-    <w:lvl w:ilvl="0" w:tplc="2752C728">
+    <w:tmpl w:val="2924B906"/>
+    <w:lvl w:ilvl="0" w:tplc="BAA62708">
       <w:start w:val="1"/>
       <w:numFmt w:val="decimal"/>
       <w:lvlText w:val="%1."/>
@@ -12563,52 +12566,52 @@
         <w:ind w:left="720" w:hanging="360"/>
       </w:pPr>
     </w:lvl>
-    <w:lvl w:ilvl="1" w:tplc="D9B0D930">
+    <w:lvl w:ilvl="1" w:tplc="C5247EAE">
       <w:numFmt w:val="decimal"/>
       <w:lvlText w:val=""/>
       <w:lvlJc w:val="left"/>
     </w:lvl>
-    <w:lvl w:ilvl="2" w:tplc="BFDE3234">
+    <w:lvl w:ilvl="2" w:tplc="63807EC4">
       <w:numFmt w:val="decimal"/>
       <w:lvlText w:val=""/>
       <w:lvlJc w:val="left"/>
     </w:lvl>
-    <w:lvl w:ilvl="3" w:tplc="4FF86192">
+    <w:lvl w:ilvl="3" w:tplc="C47EC224">
       <w:numFmt w:val="decimal"/>
       <w:lvlText w:val=""/>
       <w:lvlJc w:val="left"/>
     </w:lvl>
-    <w:lvl w:ilvl="4" w:tplc="81507C74">
+    <w:lvl w:ilvl="4" w:tplc="50BE049E">
       <w:numFmt w:val="decimal"/>
       <w:lvlText w:val=""/>
       <w:lvlJc w:val="left"/>
     </w:lvl>
-    <w:lvl w:ilvl="5" w:tplc="F8626CDC">
+    <w:lvl w:ilvl="5" w:tplc="78F828A6">
       <w:numFmt w:val="decimal"/>
       <w:lvlText w:val=""/>
       <w:lvlJc w:val="left"/>
     </w:lvl>
-    <w:lvl w:ilvl="6" w:tplc="91BE964A">
+    <w:lvl w:ilvl="6" w:tplc="C3869472">
       <w:numFmt w:val="decimal"/>
       <w:lvlText w:val=""/>
       <w:lvlJc w:val="left"/>
     </w:lvl>
-    <w:lvl w:ilvl="7" w:tplc="321A8948">
+    <w:lvl w:ilvl="7" w:tplc="7584CC88">
       <w:numFmt w:val="decimal"/>
       <w:lvlText w:val=""/>
       <w:lvlJc w:val="left"/>
     </w:lvl>
-    <w:lvl w:ilvl="8" w:tplc="32B84ADC">
+    <w:lvl w:ilvl="8" w:tplc="288245A0">
       <w:numFmt w:val="decimal"/>
       <w:lvlText w:val=""/>
       <w:lvlJc w:val="left"/>
     </w:lvl>
   </w:abstractNum>
   <w:abstractNum w:abstractNumId="3" w15:restartNumberingAfterBreak="0">
-    <w:nsid w:val="1A321865"/>
+    <w:nsid w:val="34B54ECE"/>
     <w:multiLevelType w:val="hybridMultilevel"/>
-    <w:tmpl w:val="EDEC1654"/>
-    <w:lvl w:ilvl="0" w:tplc="E208FD82" w:tentative="1">
+    <w:tmpl w:val="798E9A8E"/>
+    <w:lvl w:ilvl="0" w:tplc="D5022D0C" w:tentative="1">
       <w:start w:val="1"/>
       <w:numFmt w:val="bullet"/>
       <w:lvlText w:val="●"/>
@@ -12617,7 +12620,7 @@
         <w:ind w:left="720" w:hanging="360"/>
       </w:pPr>
     </w:lvl>
-    <w:lvl w:ilvl="1" w:tplc="112C1E40" w:tentative="1">
+    <w:lvl w:ilvl="1" w:tplc="AAAAB90C" w:tentative="1">
       <w:start w:val="1"/>
       <w:numFmt w:val="bullet"/>
       <w:lvlText w:val="○"/>
@@ -12626,7 +12629,7 @@
         <w:ind w:left="1440" w:hanging="360"/>
       </w:pPr>
     </w:lvl>
-    <w:lvl w:ilvl="2" w:tplc="FEA0F9C0" w:tentative="1">
+    <w:lvl w:ilvl="2" w:tplc="8D72E708" w:tentative="1">
       <w:start w:val="1"/>
       <w:numFmt w:val="bullet"/>
       <w:lvlText w:val="■"/>
@@ -12635,7 +12638,7 @@
         <w:ind w:left="2160" w:hanging="360"/>
       </w:pPr>
     </w:lvl>
-    <w:lvl w:ilvl="3" w:tplc="FC06231E" w:tentative="1">
+    <w:lvl w:ilvl="3" w:tplc="A7CA9D8E" w:tentative="1">
       <w:start w:val="1"/>
       <w:numFmt w:val="bullet"/>
       <w:lvlText w:val="●"/>
@@ -12644,7 +12647,7 @@
         <w:ind w:left="2880" w:hanging="360"/>
       </w:pPr>
     </w:lvl>
-    <w:lvl w:ilvl="4" w:tplc="A32E8EFC" w:tentative="1">
+    <w:lvl w:ilvl="4" w:tplc="DBE68D4E" w:tentative="1">
       <w:start w:val="1"/>
       <w:numFmt w:val="bullet"/>
       <w:lvlText w:val="○"/>
@@ -12653,7 +12656,7 @@
         <w:ind w:left="3600" w:hanging="360"/>
       </w:pPr>
     </w:lvl>
-    <w:lvl w:ilvl="5" w:tplc="F1FA987A" w:tentative="1">
+    <w:lvl w:ilvl="5" w:tplc="7EC4A97A" w:tentative="1">
       <w:start w:val="1"/>
       <w:numFmt w:val="bullet"/>
       <w:lvlText w:val="■"/>
@@ -12662,7 +12665,7 @@
         <w:ind w:left="4320" w:hanging="360"/>
       </w:pPr>
     </w:lvl>
-    <w:lvl w:ilvl="6" w:tplc="E51E3028" w:tentative="1">
+    <w:lvl w:ilvl="6" w:tplc="1DB02818" w:tentative="1">
       <w:start w:val="1"/>
       <w:numFmt w:val="bullet"/>
       <w:lvlText w:val="●"/>
@@ -12671,7 +12674,7 @@
         <w:ind w:left="5040" w:hanging="360"/>
       </w:pPr>
     </w:lvl>
-    <w:lvl w:ilvl="7" w:tplc="D814F4FA" w:tentative="1">
+    <w:lvl w:ilvl="7" w:tplc="6518B872" w:tentative="1">
       <w:start w:val="1"/>
       <w:numFmt w:val="bullet"/>
       <w:lvlText w:val="●"/>
@@ -12680,7 +12683,7 @@
         <w:ind w:left="5760" w:hanging="360"/>
       </w:pPr>
     </w:lvl>
-    <w:lvl w:ilvl="8" w:tplc="DCC03DC2" w:tentative="1">
+    <w:lvl w:ilvl="8" w:tplc="6C0EB898" w:tentative="1">
       <w:start w:val="1"/>
       <w:numFmt w:val="bullet"/>
       <w:lvlText w:val="●"/>
@@ -12691,64 +12694,64 @@
     </w:lvl>
   </w:abstractNum>
   <w:abstractNum w:abstractNumId="4" w15:restartNumberingAfterBreak="0">
-    <w:nsid w:val="1B2925E2"/>
+    <w:nsid w:val="38F71D11"/>
     <w:multiLevelType w:val="hybridMultilevel"/>
-    <w:tmpl w:val="F676A6B0"/>
-    <w:lvl w:ilvl="0" w:tplc="52BEB414">
+    <w:tmpl w:val="88523D1C"/>
+    <w:lvl w:ilvl="0" w:tplc="D982F604">
       <w:start w:val="1"/>
-      <w:numFmt w:val="decimal"/>
-      <w:lvlText w:val="%1."/>
+      <w:numFmt w:val="bullet"/>
+      <w:lvlText w:val="•"/>
       <w:lvlJc w:val="left"/>
       <w:pPr>
         <w:ind w:left="720" w:hanging="360"/>
       </w:pPr>
     </w:lvl>
-    <w:lvl w:ilvl="1" w:tplc="1A7A27DE">
+    <w:lvl w:ilvl="1" w:tplc="911A0F14">
       <w:numFmt w:val="decimal"/>
       <w:lvlText w:val=""/>
       <w:lvlJc w:val="left"/>
     </w:lvl>
-    <w:lvl w:ilvl="2" w:tplc="F7982C00">
+    <w:lvl w:ilvl="2" w:tplc="ECF40B9E">
       <w:numFmt w:val="decimal"/>
       <w:lvlText w:val=""/>
       <w:lvlJc w:val="left"/>
     </w:lvl>
-    <w:lvl w:ilvl="3" w:tplc="6A608716">
+    <w:lvl w:ilvl="3" w:tplc="140C84A4">
       <w:numFmt w:val="decimal"/>
       <w:lvlText w:val=""/>
       <w:lvlJc w:val="left"/>
     </w:lvl>
-    <w:lvl w:ilvl="4" w:tplc="CD4450A8">
+    <w:lvl w:ilvl="4" w:tplc="19E0ED20">
       <w:numFmt w:val="decimal"/>
       <w:lvlText w:val=""/>
       <w:lvlJc w:val="left"/>
     </w:lvl>
-    <w:lvl w:ilvl="5" w:tplc="9962D100">
+    <w:lvl w:ilvl="5" w:tplc="A252ADA0">
       <w:numFmt w:val="decimal"/>
       <w:lvlText w:val=""/>
       <w:lvlJc w:val="left"/>
     </w:lvl>
-    <w:lvl w:ilvl="6" w:tplc="A56493A2">
+    <w:lvl w:ilvl="6" w:tplc="5DFAAE92">
       <w:numFmt w:val="decimal"/>
       <w:lvlText w:val=""/>
       <w:lvlJc w:val="left"/>
     </w:lvl>
-    <w:lvl w:ilvl="7" w:tplc="2A22E9C6">
+    <w:lvl w:ilvl="7" w:tplc="C92083E6">
       <w:numFmt w:val="decimal"/>
       <w:lvlText w:val=""/>
       <w:lvlJc w:val="left"/>
     </w:lvl>
-    <w:lvl w:ilvl="8" w:tplc="D2CA23C8">
+    <w:lvl w:ilvl="8" w:tplc="87E2685A">
       <w:numFmt w:val="decimal"/>
       <w:lvlText w:val=""/>
       <w:lvlJc w:val="left"/>
     </w:lvl>
   </w:abstractNum>
   <w:abstractNum w:abstractNumId="5" w15:restartNumberingAfterBreak="0">
-    <w:nsid w:val="276A4FEF"/>
+    <w:nsid w:val="3AE05899"/>
     <w:multiLevelType w:val="hybridMultilevel"/>
-    <w:tmpl w:val="A31E32F0"/>
-    <w:lvl w:ilvl="0" w:tplc="A24CD498">
+    <w:tmpl w:val="762E2418"/>
+    <w:lvl w:ilvl="0" w:tplc="08BEA9F8">
       <w:start w:val="1"/>
       <w:numFmt w:val="decimal"/>
       <w:lvlText w:val="%1."/>
@@ -12757,106 +12760,106 @@
         <w:ind w:left="720" w:hanging="360"/>
       </w:pPr>
     </w:lvl>
-    <w:lvl w:ilvl="1" w:tplc="8014F426">
+    <w:lvl w:ilvl="1" w:tplc="2B6E7486">
       <w:numFmt w:val="decimal"/>
       <w:lvlText w:val=""/>
       <w:lvlJc w:val="left"/>
     </w:lvl>
-    <w:lvl w:ilvl="2" w:tplc="E6282AE8">
+    <w:lvl w:ilvl="2" w:tplc="D3B08D98">
       <w:numFmt w:val="decimal"/>
       <w:lvlText w:val=""/>
       <w:lvlJc w:val="left"/>
     </w:lvl>
-    <w:lvl w:ilvl="3" w:tplc="68121222">
+    <w:lvl w:ilvl="3" w:tplc="A71A1A04">
       <w:numFmt w:val="decimal"/>
       <w:lvlText w:val=""/>
       <w:lvlJc w:val="left"/>
     </w:lvl>
-    <w:lvl w:ilvl="4" w:tplc="0A9EA53E">
+    <w:lvl w:ilvl="4" w:tplc="72CA09A4">
       <w:numFmt w:val="decimal"/>
       <w:lvlText w:val=""/>
       <w:lvlJc w:val="left"/>
     </w:lvl>
-    <w:lvl w:ilvl="5" w:tplc="C0DA1358">
+    <w:lvl w:ilvl="5" w:tplc="448884AA">
       <w:numFmt w:val="decimal"/>
       <w:lvlText w:val=""/>
       <w:lvlJc w:val="left"/>
     </w:lvl>
-    <w:lvl w:ilvl="6" w:tplc="5E9E6A6C">
+    <w:lvl w:ilvl="6" w:tplc="EA26687A">
       <w:numFmt w:val="decimal"/>
       <w:lvlText w:val=""/>
       <w:lvlJc w:val="left"/>
     </w:lvl>
-    <w:lvl w:ilvl="7" w:tplc="3B7ECBAA">
+    <w:lvl w:ilvl="7" w:tplc="754657BE">
       <w:numFmt w:val="decimal"/>
       <w:lvlText w:val=""/>
       <w:lvlJc w:val="left"/>
     </w:lvl>
-    <w:lvl w:ilvl="8" w:tplc="ECF61D22">
+    <w:lvl w:ilvl="8" w:tplc="AC12C280">
       <w:numFmt w:val="decimal"/>
       <w:lvlText w:val=""/>
       <w:lvlJc w:val="left"/>
     </w:lvl>
   </w:abstractNum>
   <w:abstractNum w:abstractNumId="6" w15:restartNumberingAfterBreak="0">
-    <w:nsid w:val="44D31207"/>
+    <w:nsid w:val="4E862A6F"/>
     <w:multiLevelType w:val="hybridMultilevel"/>
-    <w:tmpl w:val="9E22E4E2"/>
-    <w:lvl w:ilvl="0" w:tplc="52BC712A">
+    <w:tmpl w:val="1E062EF4"/>
+    <w:lvl w:ilvl="0" w:tplc="B2561334">
       <w:start w:val="1"/>
-      <w:numFmt w:val="bullet"/>
-      <w:lvlText w:val="•"/>
+      <w:numFmt w:val="decimal"/>
+      <w:lvlText w:val="%1."/>
       <w:lvlJc w:val="left"/>
       <w:pPr>
         <w:ind w:left="720" w:hanging="360"/>
       </w:pPr>
     </w:lvl>
-    <w:lvl w:ilvl="1" w:tplc="BFC44822">
+    <w:lvl w:ilvl="1" w:tplc="0D78FF74">
       <w:numFmt w:val="decimal"/>
       <w:lvlText w:val=""/>
       <w:lvlJc w:val="left"/>
     </w:lvl>
-    <w:lvl w:ilvl="2" w:tplc="C2FCCD7C">
+    <w:lvl w:ilvl="2" w:tplc="9EB037F8">
       <w:numFmt w:val="decimal"/>
       <w:lvlText w:val=""/>
       <w:lvlJc w:val="left"/>
     </w:lvl>
-    <w:lvl w:ilvl="3" w:tplc="86A4CFA8">
+    <w:lvl w:ilvl="3" w:tplc="86F635F0">
       <w:numFmt w:val="decimal"/>
       <w:lvlText w:val=""/>
       <w:lvlJc w:val="left"/>
     </w:lvl>
-    <w:lvl w:ilvl="4" w:tplc="0E02BDDE">
+    <w:lvl w:ilvl="4" w:tplc="9BB4DAC6">
       <w:numFmt w:val="decimal"/>
       <w:lvlText w:val=""/>
       <w:lvlJc w:val="left"/>
     </w:lvl>
-    <w:lvl w:ilvl="5" w:tplc="A8A68C10">
+    <w:lvl w:ilvl="5" w:tplc="96884CC8">
       <w:numFmt w:val="decimal"/>
       <w:lvlText w:val=""/>
       <w:lvlJc w:val="left"/>
     </w:lvl>
-    <w:lvl w:ilvl="6" w:tplc="A712DEF4">
+    <w:lvl w:ilvl="6" w:tplc="EEC0DC32">
       <w:numFmt w:val="decimal"/>
       <w:lvlText w:val=""/>
       <w:lvlJc w:val="left"/>
     </w:lvl>
-    <w:lvl w:ilvl="7" w:tplc="B4887A50">
+    <w:lvl w:ilvl="7" w:tplc="FB2E9BE0">
       <w:numFmt w:val="decimal"/>
       <w:lvlText w:val=""/>
       <w:lvlJc w:val="left"/>
     </w:lvl>
-    <w:lvl w:ilvl="8" w:tplc="F57E8890">
+    <w:lvl w:ilvl="8" w:tplc="453EB4A0">
       <w:numFmt w:val="decimal"/>
       <w:lvlText w:val=""/>
       <w:lvlJc w:val="left"/>
     </w:lvl>
   </w:abstractNum>
   <w:abstractNum w:abstractNumId="7" w15:restartNumberingAfterBreak="0">
-    <w:nsid w:val="4C675C79"/>
+    <w:nsid w:val="7DDB130B"/>
     <w:multiLevelType w:val="hybridMultilevel"/>
-    <w:tmpl w:val="BEC4D73A"/>
-    <w:lvl w:ilvl="0" w:tplc="77EE5B36">
+    <w:tmpl w:val="66961EC2"/>
+    <w:lvl w:ilvl="0" w:tplc="464ADBD2">
       <w:start w:val="1"/>
       <w:numFmt w:val="decimal"/>
       <w:lvlText w:val="%1."/>
@@ -12865,52 +12868,52 @@
         <w:ind w:left="720" w:hanging="360"/>
       </w:pPr>
     </w:lvl>
-    <w:lvl w:ilvl="1" w:tplc="B34CEBFE">
+    <w:lvl w:ilvl="1" w:tplc="9B9EA652">
       <w:numFmt w:val="decimal"/>
       <w:lvlText w:val=""/>
       <w:lvlJc w:val="left"/>
     </w:lvl>
-    <w:lvl w:ilvl="2" w:tplc="F702CAA4">
+    <w:lvl w:ilvl="2" w:tplc="2FF2B566">
       <w:numFmt w:val="decimal"/>
       <w:lvlText w:val=""/>
       <w:lvlJc w:val="left"/>
     </w:lvl>
-    <w:lvl w:ilvl="3" w:tplc="70587458">
+    <w:lvl w:ilvl="3" w:tplc="A8A68562">
       <w:numFmt w:val="decimal"/>
       <w:lvlText w:val=""/>
       <w:lvlJc w:val="left"/>
     </w:lvl>
-    <w:lvl w:ilvl="4" w:tplc="C13E09E2">
+    <w:lvl w:ilvl="4" w:tplc="A88A48E2">
       <w:numFmt w:val="decimal"/>
       <w:lvlText w:val=""/>
       <w:lvlJc w:val="left"/>
     </w:lvl>
-    <w:lvl w:ilvl="5" w:tplc="A1F83BD8">
+    <w:lvl w:ilvl="5" w:tplc="9668AA2C">
       <w:numFmt w:val="decimal"/>
       <w:lvlText w:val=""/>
       <w:lvlJc w:val="left"/>
     </w:lvl>
-    <w:lvl w:ilvl="6" w:tplc="5524A034">
+    <w:lvl w:ilvl="6" w:tplc="DB40AB56">
       <w:numFmt w:val="decimal"/>
       <w:lvlText w:val=""/>
       <w:lvlJc w:val="left"/>
     </w:lvl>
-    <w:lvl w:ilvl="7" w:tplc="68BEDB90">
+    <w:lvl w:ilvl="7" w:tplc="B7B0925C">
       <w:numFmt w:val="decimal"/>
       <w:lvlText w:val=""/>
       <w:lvlJc w:val="left"/>
     </w:lvl>
-    <w:lvl w:ilvl="8" w:tplc="E472A308">
+    <w:lvl w:ilvl="8" w:tplc="67E2C934">
       <w:numFmt w:val="decimal"/>
       <w:lvlText w:val=""/>
       <w:lvlJc w:val="left"/>
     </w:lvl>
   </w:abstractNum>
   <w:abstractNum w:abstractNumId="8" w15:restartNumberingAfterBreak="0">
-    <w:nsid w:val="766004DC"/>
+    <w:nsid w:val="7E2478A0"/>
     <w:multiLevelType w:val="hybridMultilevel"/>
-    <w:tmpl w:val="1D464B02"/>
-    <w:lvl w:ilvl="0" w:tplc="DF4E73F0">
+    <w:tmpl w:val="C1545194"/>
+    <w:lvl w:ilvl="0" w:tplc="F1DE585C">
       <w:start w:val="1"/>
       <w:numFmt w:val="decimal"/>
       <w:lvlText w:val="%1."/>
@@ -12919,97 +12922,97 @@
         <w:ind w:left="720" w:hanging="360"/>
       </w:pPr>
     </w:lvl>
-    <w:lvl w:ilvl="1" w:tplc="1FC676B4">
+    <w:lvl w:ilvl="1" w:tplc="3672400C">
       <w:numFmt w:val="decimal"/>
       <w:lvlText w:val=""/>
       <w:lvlJc w:val="left"/>
     </w:lvl>
-    <w:lvl w:ilvl="2" w:tplc="516E77A0">
+    <w:lvl w:ilvl="2" w:tplc="7BFE476C">
       <w:numFmt w:val="decimal"/>
       <w:lvlText w:val=""/>
       <w:lvlJc w:val="left"/>
     </w:lvl>
-    <w:lvl w:ilvl="3" w:tplc="C0C8494E">
+    <w:lvl w:ilvl="3" w:tplc="5994FE76">
       <w:numFmt w:val="decimal"/>
       <w:lvlText w:val=""/>
       <w:lvlJc w:val="left"/>
     </w:lvl>
-    <w:lvl w:ilvl="4" w:tplc="A13AC374">
+    <w:lvl w:ilvl="4" w:tplc="8C3E8D36">
       <w:numFmt w:val="decimal"/>
       <w:lvlText w:val=""/>
       <w:lvlJc w:val="left"/>
     </w:lvl>
-    <w:lvl w:ilvl="5" w:tplc="CE7E42BE">
+    <w:lvl w:ilvl="5" w:tplc="B8C4E212">
       <w:numFmt w:val="decimal"/>
       <w:lvlText w:val=""/>
       <w:lvlJc w:val="left"/>
     </w:lvl>
-    <w:lvl w:ilvl="6" w:tplc="C56AFF16">
+    <w:lvl w:ilvl="6" w:tplc="468AA756">
       <w:numFmt w:val="decimal"/>
       <w:lvlText w:val=""/>
       <w:lvlJc w:val="left"/>
     </w:lvl>
-    <w:lvl w:ilvl="7" w:tplc="A0AC7070">
+    <w:lvl w:ilvl="7" w:tplc="3370A062">
       <w:numFmt w:val="decimal"/>
       <w:lvlText w:val=""/>
       <w:lvlJc w:val="left"/>
     </w:lvl>
-    <w:lvl w:ilvl="8" w:tplc="1CB6F768">
+    <w:lvl w:ilvl="8" w:tplc="77B604B6">
       <w:numFmt w:val="decimal"/>
       <w:lvlText w:val=""/>
       <w:lvlJc w:val="left"/>
     </w:lvl>
   </w:abstractNum>
-  <w:num w:numId="1" w16cid:durableId="191189364">
+  <w:num w:numId="1" w16cid:durableId="752817550">
     <w:abstractNumId w:val="3"/>
     <w:lvlOverride w:ilvl="0">
       <w:startOverride w:val="1"/>
     </w:lvlOverride>
   </w:num>
-  <w:num w:numId="2" w16cid:durableId="1207715771">
+  <w:num w:numId="2" w16cid:durableId="1634796963">
     <w:abstractNumId w:val="8"/>
     <w:lvlOverride w:ilvl="0">
       <w:startOverride w:val="1"/>
     </w:lvlOverride>
   </w:num>
-  <w:num w:numId="3" w16cid:durableId="743572563">
+  <w:num w:numId="3" w16cid:durableId="940070542">
+    <w:abstractNumId w:val="0"/>
+    <w:lvlOverride w:ilvl="0">
+      <w:startOverride w:val="1"/>
+    </w:lvlOverride>
+  </w:num>
+  <w:num w:numId="4" w16cid:durableId="188418765">
+    <w:abstractNumId w:val="4"/>
+    <w:lvlOverride w:ilvl="0">
+      <w:startOverride w:val="1"/>
+    </w:lvlOverride>
+  </w:num>
+  <w:num w:numId="5" w16cid:durableId="599531164">
+    <w:abstractNumId w:val="5"/>
+    <w:lvlOverride w:ilvl="0">
+      <w:startOverride w:val="1"/>
+    </w:lvlOverride>
+  </w:num>
+  <w:num w:numId="6" w16cid:durableId="567423149">
+    <w:abstractNumId w:val="6"/>
+    <w:lvlOverride w:ilvl="0">
+      <w:startOverride w:val="1"/>
+    </w:lvlOverride>
+  </w:num>
+  <w:num w:numId="7" w16cid:durableId="740248515">
     <w:abstractNumId w:val="1"/>
     <w:lvlOverride w:ilvl="0">
       <w:startOverride w:val="1"/>
     </w:lvlOverride>
   </w:num>
-  <w:num w:numId="4" w16cid:durableId="1887797070">
-    <w:abstractNumId w:val="6"/>
-    <w:lvlOverride w:ilvl="0">
-      <w:startOverride w:val="1"/>
-    </w:lvlOverride>
-  </w:num>
-  <w:num w:numId="5" w16cid:durableId="2142188743">
-    <w:abstractNumId w:val="4"/>
-    <w:lvlOverride w:ilvl="0">
-      <w:startOverride w:val="1"/>
-    </w:lvlOverride>
-  </w:num>
-  <w:num w:numId="6" w16cid:durableId="386613814">
-    <w:abstractNumId w:val="0"/>
-    <w:lvlOverride w:ilvl="0">
-      <w:startOverride w:val="1"/>
-    </w:lvlOverride>
-  </w:num>
-  <w:num w:numId="7" w16cid:durableId="1513717002">
+  <w:num w:numId="8" w16cid:durableId="587808669">
     <w:abstractNumId w:val="7"/>
     <w:lvlOverride w:ilvl="0">
       <w:startOverride w:val="1"/>
     </w:lvlOverride>
   </w:num>
-  <w:num w:numId="8" w16cid:durableId="1949778446">
+  <w:num w:numId="9" w16cid:durableId="1084840131">
     <w:abstractNumId w:val="2"/>
-    <w:lvlOverride w:ilvl="0">
-      <w:startOverride w:val="1"/>
-    </w:lvlOverride>
-  </w:num>
-  <w:num w:numId="9" w16cid:durableId="738287009">
-    <w:abstractNumId w:val="5"/>
     <w:lvlOverride w:ilvl="0">
       <w:startOverride w:val="1"/>
     </w:lvlOverride>

</xml_diff>